<commit_message>
feat: enhance notice builder batch processing
</commit_message>
<xml_diff>
--- a/research/notice_template/MAU_22_THONG_BAO_XAC_NHAN_KET_QUA_DANG_KY_DAT_DAI.docx
+++ b/research/notice_template/MAU_22_THONG_BAO_XAC_NHAN_KET_QUA_DANG_KY_DAT_DAI.docx
@@ -492,17 +492,17 @@
         </w:tabs>
         <w:spacing w:line="360" w:lineRule="auto"/>
         <w:ind w:firstLine="720"/>
+        <w:rPr>
+          <w:sz w:val="28"/>
+          <w:szCs w:val="28"/>
+        </w:rPr>
         <w:jc w:val="left"/>
-        <w:rPr>
-          <w:sz w:val="28"/>
-          <w:szCs w:val="28"/>
-        </w:rPr>
       </w:pPr>
       <w:r>
         <w:rPr>
           <w:sz w:val="28"/>
         </w:rPr>
-        <w:t xml:space="preserve">a) Thửa đất số: {{SO_THUA}}; b) Tờ bản đồ số: {{SO_TO}}.</w:t>
+        <w:t>a) Thửa đất số: {{SO_THUA}}; b) Tờ bản đồ số: {{SO_TO}}.</w:t>
       </w:r>
     </w:p>
     <w:p>
@@ -512,52 +512,52 @@
         </w:tabs>
         <w:spacing w:line="360" w:lineRule="auto"/>
         <w:ind w:firstLine="720"/>
+        <w:rPr>
+          <w:sz w:val="28"/>
+          <w:szCs w:val="28"/>
+        </w:rPr>
         <w:jc w:val="left"/>
-        <w:rPr>
-          <w:sz w:val="28"/>
-          <w:szCs w:val="28"/>
-        </w:rPr>
       </w:pPr>
       <w:r>
         <w:rPr>
           <w:sz w:val="28"/>
         </w:rPr>
-        <w:t xml:space="preserve">c) Địa chỉ: xứ đồng {{XU_DONG}}, thôn {{TEN_THON}}, {{DIA_CHI_HANH_CHINH}}</w:t>
+        <w:t>c) Địa chỉ: xứ đồng {{XU_DONG}}, thôn {{TEN_THON}}, {{DIA_CHI_HANH_CHINH}}</w:t>
       </w:r>
     </w:p>
     <w:p>
       <w:pPr>
         <w:spacing w:line="360" w:lineRule="auto"/>
         <w:ind w:firstLine="720"/>
+        <w:rPr>
+          <w:sz w:val="28"/>
+          <w:szCs w:val="28"/>
+        </w:rPr>
         <w:jc w:val="left"/>
-        <w:rPr>
-          <w:sz w:val="28"/>
-          <w:szCs w:val="28"/>
-        </w:rPr>
       </w:pPr>
       <w:r>
         <w:rPr>
           <w:sz w:val="28"/>
         </w:rPr>
-        <w:t xml:space="preserve">d) Diện tích: {{DIEN_TICH}} m2 (trong đó: Đất chuyên trồng lúa nước (LUC) {{DIEN_TICH}} m2);</w:t>
+        <w:t>d) Diện tích: {{DIEN_TICH}} m2 (trong đó: Đất chuyên trồng lúa nước (LUC) {{DIEN_TICH}} m2);</w:t>
       </w:r>
     </w:p>
     <w:p>
       <w:pPr>
         <w:spacing w:line="360" w:lineRule="auto"/>
         <w:ind w:firstLine="720"/>
+        <w:rPr>
+          <w:sz w:val="28"/>
+          <w:szCs w:val="28"/>
+        </w:rPr>
         <w:jc w:val="left"/>
-        <w:rPr>
-          <w:sz w:val="28"/>
-          <w:szCs w:val="28"/>
-        </w:rPr>
       </w:pPr>
       <w:r>
         <w:rPr>
           <w:sz w:val="28"/>
           <w:szCs w:val="28"/>
         </w:rPr>
-        <w:t xml:space="preserve">Hình thức sử dụng: sử dụng chung của vợ chồng: </w:t>
+        <w:t xml:space="preserve">Hình thức sử dụng: sử dụng chung: </w:t>
       </w:r>
       <w:r>
         <w:rPr>
@@ -565,7 +565,23 @@
           <w:sz w:val="28"/>
           <w:szCs w:val="28"/>
         </w:rPr>
-        <w:t>{{SU_DUNG_CHUNG_VO_CHONG}}</w:t>
+        <w:t>{{SU_DUNG_CHU</w:t>
+      </w:r>
+      <w:r>
+        <w:rPr>
+          <w:noProof/>
+          <w:sz w:val="28"/>
+          <w:szCs w:val="28"/>
+        </w:rPr>
+        <w:t>NG</w:t>
+      </w:r>
+      <w:r>
+        <w:rPr>
+          <w:noProof/>
+          <w:sz w:val="28"/>
+          <w:szCs w:val="28"/>
+        </w:rPr>
+        <w:t>}}</w:t>
       </w:r>
       <w:r>
         <w:rPr>
@@ -587,25 +603,25 @@
           <w:sz w:val="28"/>
           <w:szCs w:val="28"/>
         </w:rPr>
-        <w:t xml:space="preserve">;</w:t>
+        <w:t>;</w:t>
       </w:r>
     </w:p>
     <w:p>
       <w:pPr>
         <w:spacing w:line="360" w:lineRule="auto"/>
         <w:ind w:firstLine="720"/>
+        <w:rPr>
+          <w:sz w:val="28"/>
+          <w:szCs w:val="28"/>
+          <w:vertAlign w:val="superscript"/>
+        </w:rPr>
         <w:jc w:val="left"/>
-        <w:rPr>
-          <w:sz w:val="28"/>
-          <w:szCs w:val="28"/>
-          <w:vertAlign w:val="superscript"/>
-        </w:rPr>
       </w:pPr>
       <w:r>
         <w:rPr>
           <w:sz w:val="28"/>
         </w:rPr>
-        <w:t>sử dụng riêng: {{SU_DUNG_RIENG}} m2; Sử dụng chung của nhóm người: {{DIEN_TICH}} m2</w:t>
+        <w:t xml:space="preserve">sử dụng riêng: {{SU_DUNG_RIENG}} m2;</w:t>
       </w:r>
     </w:p>
     <w:p>
@@ -615,12 +631,12 @@
         </w:tabs>
         <w:spacing w:line="420" w:lineRule="exact"/>
         <w:ind w:firstLine="720"/>
+        <w:rPr>
+          <w:spacing w:val="-4"/>
+          <w:sz w:val="28"/>
+          <w:szCs w:val="28"/>
+        </w:rPr>
         <w:jc w:val="left"/>
-        <w:rPr>
-          <w:spacing w:val="-4"/>
-          <w:sz w:val="28"/>
-          <w:szCs w:val="28"/>
-        </w:rPr>
       </w:pPr>
       <w:r>
         <w:rPr>
@@ -639,15 +655,6 @@
       </w:r>
       <w:r>
         <w:rPr>
-          <w:sz w:val="28"/>
-          <w:szCs w:val="28"/>
-        </w:rPr>
-        <w:t xml:space="preserve"> từ thời điểm: {{THOI_DIEM_SU_DUNG}}</w:t>
-      </w:r>
-      <w:r>
-        <w:rPr>
-          <w:i/>
-          <w:spacing w:val="-4"/>
           <w:sz w:val="28"/>
           <w:szCs w:val="28"/>
         </w:rPr>
@@ -658,19 +665,27 @@
       <w:pPr>
         <w:spacing w:line="360" w:lineRule="auto"/>
         <w:ind w:firstLine="567"/>
+        <w:rPr>
+          <w:spacing w:val="-6"/>
+          <w:sz w:val="28"/>
+          <w:szCs w:val="28"/>
+        </w:rPr>
         <w:jc w:val="left"/>
+      </w:pPr>
+      <w:r>
+        <w:rPr>
+          <w:sz w:val="28"/>
+          <w:szCs w:val="28"/>
+        </w:rPr>
+        <w:t xml:space="preserve">e) Thời hạn đề nghị được sử dụng đất: </w:t>
+      </w:r>
+      <w:r>
         <w:rPr>
           <w:spacing w:val="-6"/>
           <w:sz w:val="28"/>
           <w:szCs w:val="28"/>
         </w:rPr>
-      </w:pPr>
-      <w:r>
-        <w:rPr>
-          <w:sz w:val="28"/>
-          <w:szCs w:val="28"/>
-        </w:rPr>
-        <w:t xml:space="preserve">e) Thời hạn đề nghị được sử dụng đất: </w:t>
+        <w:t xml:space="preserve">Đất chuyên trồng lúa nước (LUC): </w:t>
       </w:r>
       <w:r>
         <w:rPr>
@@ -678,18 +693,26 @@
           <w:sz w:val="28"/>
           <w:szCs w:val="28"/>
         </w:rPr>
-        <w:t>Đất chuyên trồng lúa nước (LUC): {{THOI_HAN_SU_DUNG}}.</w:t>
+        <w:t>chưa xác định</w:t>
+      </w:r>
+      <w:r>
+        <w:rPr>
+          <w:spacing w:val="-6"/>
+          <w:sz w:val="28"/>
+          <w:szCs w:val="28"/>
+        </w:rPr>
+        <w:t>.</w:t>
       </w:r>
     </w:p>
     <w:p>
       <w:pPr>
         <w:spacing w:line="360" w:lineRule="auto"/>
         <w:ind w:firstLine="567"/>
+        <w:rPr>
+          <w:sz w:val="28"/>
+          <w:szCs w:val="28"/>
+        </w:rPr>
         <w:jc w:val="left"/>
-        <w:rPr>
-          <w:sz w:val="28"/>
-          <w:szCs w:val="28"/>
-        </w:rPr>
       </w:pPr>
       <w:r>
         <w:rPr>
@@ -706,11 +729,11 @@
         </w:tabs>
         <w:spacing w:line="360" w:lineRule="auto"/>
         <w:ind w:firstLine="720"/>
+        <w:rPr>
+          <w:sz w:val="28"/>
+          <w:szCs w:val="28"/>
+        </w:rPr>
         <w:jc w:val="left"/>
-        <w:rPr>
-          <w:sz w:val="28"/>
-          <w:szCs w:val="28"/>
-        </w:rPr>
       </w:pPr>
       <w:r>
         <w:rPr>
@@ -740,7 +763,6 @@
         <w:t xml:space="preserve">, của </w:t>
       </w:r>
       <w:r>
-        <w:lastRenderedPageBreak/>
         <w:t>{{CHU_SU_HUU_LIEN_KE}}</w:t>
       </w:r>
       <w:r>
@@ -811,6 +833,7 @@
           <w:sz w:val="28"/>
           <w:szCs w:val="28"/>
         </w:rPr>
+        <w:lastRenderedPageBreak/>
         <w:t>4. Giấy tờ người sử dụng đất, chủ sở hữu tài sản gắn liền với đất, người quản lý đất đã nộp</w:t>
       </w:r>
       <w:r>
@@ -932,77 +955,7 @@
           <w:sz w:val="28"/>
           <w:szCs w:val="28"/>
         </w:rPr>
-        <w:t>g</w:t>
-      </w:r>
-      <w:r>
-        <w:rPr>
-          <w:sz w:val="28"/>
-          <w:szCs w:val="28"/>
-        </w:rPr>
-        <w:t>iao đất không thu tiền sử dụng đất (</w:t>
-      </w:r>
-      <w:r>
-        <w:rPr>
-          <w:sz w:val="28"/>
-          <w:szCs w:val="28"/>
-        </w:rPr>
-        <w:t xml:space="preserve">Đất có nguồn gốc được giao theo </w:t>
-      </w:r>
-      <w:r>
-        <w:rPr>
-          <w:sz w:val="28"/>
-          <w:szCs w:val="28"/>
-        </w:rPr>
-        <w:t>Nghị quyết số 03-NQ/TU ngày 28/4/1992 của Ban Thường vụ Tỉnh uỷ Hải Hưng</w:t>
-      </w:r>
-      <w:r>
-        <w:rPr>
-          <w:sz w:val="28"/>
-          <w:szCs w:val="28"/>
-        </w:rPr>
-        <w:t>.</w:t>
-      </w:r>
-      <w:r>
-        <w:rPr>
-          <w:sz w:val="28"/>
-          <w:szCs w:val="28"/>
-        </w:rPr>
-        <w:t xml:space="preserve"> </w:t>
-      </w:r>
-      <w:r>
-        <w:rPr>
-          <w:sz w:val="28"/>
-          <w:szCs w:val="28"/>
-        </w:rPr>
-        <w:t>N</w:t>
-      </w:r>
-      <w:r>
-        <w:rPr>
-          <w:sz w:val="28"/>
-          <w:szCs w:val="28"/>
-        </w:rPr>
-        <w:t>ăm 2003</w:t>
-      </w:r>
-      <w:r>
-        <w:rPr>
-          <w:sz w:val="28"/>
-          <w:szCs w:val="28"/>
-        </w:rPr>
-        <w:t>,</w:t>
-      </w:r>
-      <w:r>
-        <w:rPr>
-          <w:sz w:val="28"/>
-          <w:szCs w:val="28"/>
-        </w:rPr>
-        <w:t xml:space="preserve"> đã thực hiện chuyển đổi ruộng đất theo Đề án “Hướng dẫn nông dân chuyển đổi ruộng từ ô thửa nhỏ thành ô thửa lớn” được UBND tỉnh Hải Dương phê duyệt tại Quyết định số 392/2002/QĐ-UB ngày 06/02/2002</w:t>
-      </w:r>
-      <w:r>
-        <w:rPr>
-          <w:sz w:val="28"/>
-          <w:szCs w:val="28"/>
-        </w:rPr>
-        <w:t>. Đã được đo đạc lập bản đồ địa chính).</w:t>
+        <w:t>giao đất không thu tiền sử dụng đất (Đất có nguồn gốc được giao theo Nghị quyết số 03-NQ/TU ngày 28/4/1992 của Ban Thường vụ Tỉnh uỷ Hải Hưng. Năm 2003, đã thực hiện chuyển đổi ruộng đất theo Đề án “Hướng dẫn nông dân chuyển đổi ruộng từ ô thửa nhỏ thành ô thửa lớn” được UBND tỉnh Hải Dương phê duyệt tại Quyết định số 392/2002/QĐ-UB ngày 06/02/2002. Đã được đo đạc lập bản đồ địa chính).</w:t>
       </w:r>
     </w:p>
     <w:p>
@@ -1042,7 +995,7 @@
         <w:rPr>
           <w:sz w:val="28"/>
           <w:szCs w:val="28"/>
-          <w:lang w:val="vi-VN"/>
+          <w:lang w:val="en-US"/>
         </w:rPr>
       </w:pPr>
       <w:r>
@@ -1068,6 +1021,22 @@
           <w:lang w:val="vi-VN"/>
         </w:rPr>
         <w:t>đủ điều kiện cập nhập cơ sở dữ liệu đăng ký đất đai để thực hiện Kế hoạch số 150/KH-UBND ngày 24/4/2026 của UBND thành phố Hải Phòng về việc triển khai thực hiện công tác đo đạc, lập bản đồ địa chính, lập hồ sơ địa chính và hoàn thành cơ sở dữ liệu về đất đai trên địa bàn thành phố Hải Phòng.</w:t>
+      </w:r>
+      <w:r>
+        <w:rPr>
+          <w:sz w:val="28"/>
+          <w:szCs w:val="28"/>
+          <w:lang w:val="vi-VN"/>
+        </w:rPr>
+        <w:t xml:space="preserve"> </w:t>
+      </w:r>
+      <w:r>
+        <w:rPr>
+          <w:sz w:val="28"/>
+          <w:szCs w:val="28"/>
+          <w:lang w:val="en-US"/>
+        </w:rPr>
+        <w:t>Chưa đủ điều kiện cấp GCN QSD đất</w:t>
       </w:r>
     </w:p>
     <w:p>
@@ -1087,14 +1056,9 @@
       <w:r>
         <w:rPr>
           <w:sz w:val="28"/>
-        </w:rPr>
-        <w:t xml:space="preserve">- Kết luận khác: </w:t>
-      </w:r>
-      <w:r>
-        <w:rPr>
-          <w:sz w:val="28"/>
-        </w:rPr>
-        <w:t>Ông/Bà {{HO_TEN}} là người đại diện</w:t>
+          <w:lang w:val="vi-VN"/>
+        </w:rPr>
+        <w:t>- Kết luận khác: Ông/Bà {{HO_TEN}} là người đại diện</w:t>
       </w:r>
     </w:p>
     <w:p>
@@ -1218,14 +1182,14 @@
               <w:rPr>
                 <w:sz w:val="28"/>
                 <w:szCs w:val="28"/>
-                <w:lang w:val="en-US"/>
+                <w:lang w:val="vi-VN"/>
               </w:rPr>
             </w:pPr>
             <w:r>
               <w:rPr>
                 <w:sz w:val="22"/>
                 <w:szCs w:val="22"/>
-                <w:lang w:val="en-US"/>
+                <w:lang w:val="vi-VN"/>
               </w:rPr>
               <w:t>- Lưu: VT, {{DON_VI_LUU}}.</w:t>
             </w:r>
@@ -1243,7 +1207,7 @@
                 <w:b/>
                 <w:sz w:val="28"/>
                 <w:szCs w:val="28"/>
-                <w:lang w:val="en-US"/>
+                <w:lang w:val="vi-VN"/>
               </w:rPr>
             </w:pPr>
             <w:r>
@@ -1251,7 +1215,7 @@
                 <w:b/>
                 <w:sz w:val="28"/>
                 <w:szCs w:val="28"/>
-                <w:lang w:val="en-US"/>
+                <w:lang w:val="vi-VN"/>
               </w:rPr>
               <w:t>TM. ỦY BAN NHÂN DÂN</w:t>
             </w:r>
@@ -1264,7 +1228,7 @@
                 <w:b/>
                 <w:sz w:val="28"/>
                 <w:szCs w:val="28"/>
-                <w:lang w:val="en-US"/>
+                <w:lang w:val="vi-VN"/>
               </w:rPr>
             </w:pPr>
             <w:r>
@@ -1272,7 +1236,7 @@
                 <w:b/>
                 <w:sz w:val="28"/>
                 <w:szCs w:val="28"/>
-                <w:lang w:val="en-US"/>
+                <w:lang w:val="vi-VN"/>
               </w:rPr>
               <w:t>KT. CHỦ TỊCH</w:t>
             </w:r>
@@ -1285,7 +1249,7 @@
                 <w:b/>
                 <w:sz w:val="28"/>
                 <w:szCs w:val="28"/>
-                <w:lang w:val="en-US"/>
+                <w:lang w:val="vi-VN"/>
               </w:rPr>
             </w:pPr>
             <w:r>
@@ -1293,7 +1257,7 @@
                 <w:b/>
                 <w:sz w:val="28"/>
                 <w:szCs w:val="28"/>
-                <w:lang w:val="en-US"/>
+                <w:lang w:val="vi-VN"/>
               </w:rPr>
               <w:t>PHÓ CHỦ TỊCH</w:t>
             </w:r>
@@ -1306,13 +1270,14 @@
                 <w:i/>
                 <w:sz w:val="28"/>
                 <w:szCs w:val="28"/>
+                <w:lang w:val="vi-VN"/>
               </w:rPr>
             </w:pPr>
             <w:r>
               <w:rPr>
                 <w:sz w:val="28"/>
                 <w:szCs w:val="28"/>
-                <w:lang w:val="en-US"/>
+                <w:lang w:val="vi-VN"/>
               </w:rPr>
               <w:br/>
             </w:r>
@@ -1325,6 +1290,7 @@
                 <w:i/>
                 <w:sz w:val="28"/>
                 <w:szCs w:val="28"/>
+                <w:lang w:val="vi-VN"/>
               </w:rPr>
             </w:pPr>
           </w:p>
@@ -1336,6 +1302,7 @@
                 <w:i/>
                 <w:sz w:val="28"/>
                 <w:szCs w:val="28"/>
+                <w:lang w:val="vi-VN"/>
               </w:rPr>
             </w:pPr>
           </w:p>
@@ -1347,7 +1314,7 @@
                 <w:b/>
                 <w:sz w:val="28"/>
                 <w:szCs w:val="28"/>
-                <w:lang w:val="en-US"/>
+                <w:lang w:val="vi-VN"/>
               </w:rPr>
             </w:pPr>
             <w:r>
@@ -1355,7 +1322,7 @@
                 <w:b/>
                 <w:sz w:val="28"/>
                 <w:szCs w:val="28"/>
-                <w:lang w:val="en-US"/>
+                <w:lang w:val="vi-VN"/>
               </w:rPr>
               <w:t>{{NGUOI_KY}}</w:t>
             </w:r>
@@ -1363,7 +1330,13 @@
         </w:tc>
       </w:tr>
     </w:tbl>
-    <w:p/>
+    <w:p>
+      <w:pPr>
+        <w:rPr>
+          <w:lang w:val="vi-VN"/>
+        </w:rPr>
+      </w:pPr>
+    </w:p>
     <w:sectPr>
       <w:headerReference w:type="default" r:id="rId6"/>
       <w:pgSz w:w="12240" w:h="15840"/>

</xml_diff>